<commit_message>
Accepted all changes for 2.23.0 release notes
</commit_message>
<xml_diff>
--- a/doc/release/HPC DME Release Notes 2.23.0.docx
+++ b/doc/release/HPC DME Release Notes 2.23.0.docx
@@ -3630,7 +3630,6 @@
           <w:p>
             <w:pPr>
               <w:rPr>
-                <w:ins w:id="0" w:author="Menon, Sunita (NIH/NCI) [C]" w:date="2022-08-30T15:15:00Z"/>
                 <w:sz w:val="28"/>
                 <w:szCs w:val="28"/>
               </w:rPr>
@@ -3668,317 +3667,212 @@
           <w:p>
             <w:pPr>
               <w:rPr>
-                <w:ins w:id="1" w:author="Menon, Sunita (NIH/NCI) [C]" w:date="2022-08-30T15:15:00Z"/>
-                <w:sz w:val="28"/>
-                <w:szCs w:val="28"/>
-              </w:rPr>
-            </w:pPr>
-          </w:p>
-          <w:p>
-            <w:pPr>
-              <w:rPr>
-                <w:ins w:id="2" w:author="Menon, Sunita (NIH/NCI) [C]" w:date="2022-08-30T15:16:00Z"/>
-                <w:sz w:val="28"/>
-                <w:szCs w:val="28"/>
-                <w:rPrChange w:id="3" w:author="Menon, Sunita (NIH/NCI) [C]" w:date="2022-08-30T15:16:00Z">
-                  <w:rPr>
-                    <w:ins w:id="4" w:author="Menon, Sunita (NIH/NCI) [C]" w:date="2022-08-30T15:16:00Z"/>
-                  </w:rPr>
-                </w:rPrChange>
-              </w:rPr>
-            </w:pPr>
-            <w:ins w:id="5" w:author="Menon, Sunita (NIH/NCI) [C]" w:date="2022-08-30T15:15:00Z">
-              <w:r>
-                <w:rPr>
-                  <w:sz w:val="28"/>
-                  <w:szCs w:val="28"/>
-                  <w:u w:val="single"/>
-                  <w:rPrChange w:id="6" w:author="Menon, Sunita (NIH/NCI) [C]" w:date="2022-08-30T15:22:00Z">
-                    <w:rPr>
-                      <w:sz w:val="28"/>
-                      <w:szCs w:val="28"/>
-                    </w:rPr>
-                  </w:rPrChange>
-                </w:rPr>
-                <w:t>HPCDATAMGM-1629</w:t>
-              </w:r>
-              <w:r>
-                <w:rPr>
-                  <w:sz w:val="28"/>
-                  <w:szCs w:val="28"/>
-                </w:rPr>
-                <w:t xml:space="preserve">: </w:t>
-              </w:r>
-            </w:ins>
-            <w:ins w:id="7" w:author="Menon, Sunita (NIH/NCI) [C]" w:date="2022-08-30T15:16:00Z">
-              <w:r>
-                <w:rPr>
-                  <w:sz w:val="28"/>
-                  <w:szCs w:val="28"/>
-                </w:rPr>
-                <w:t>Replaced the</w:t>
-              </w:r>
-              <w:r>
-                <w:rPr>
-                  <w:sz w:val="28"/>
-                  <w:szCs w:val="28"/>
-                  <w:rPrChange w:id="8" w:author="Menon, Sunita (NIH/NCI) [C]" w:date="2022-08-30T15:16:00Z">
-                    <w:rPr/>
-                  </w:rPrChange>
-                </w:rPr>
-                <w:t xml:space="preserve"> </w:t>
-              </w:r>
-              <w:r>
-                <w:rPr>
-                  <w:i/>
-                  <w:iCs/>
-                  <w:sz w:val="28"/>
-                  <w:szCs w:val="28"/>
-                  <w:rPrChange w:id="9" w:author="Menon, Sunita (NIH/NCI) [C]" w:date="2022-08-30T15:17:00Z">
-                    <w:rPr/>
-                  </w:rPrChange>
-                </w:rPr>
-                <w:t>data_curator</w:t>
-              </w:r>
-              <w:r>
-                <w:rPr>
-                  <w:sz w:val="28"/>
-                  <w:szCs w:val="28"/>
-                  <w:rPrChange w:id="10" w:author="Menon, Sunita (NIH/NCI) [C]" w:date="2022-08-30T15:16:00Z">
-                    <w:rPr/>
-                  </w:rPrChange>
-                </w:rPr>
-                <w:t xml:space="preserve"> </w:t>
-              </w:r>
-            </w:ins>
-            <w:ins w:id="11" w:author="Menon, Sunita (NIH/NCI) [C]" w:date="2022-08-30T15:17:00Z">
-              <w:r>
-                <w:rPr>
-                  <w:sz w:val="28"/>
-                  <w:szCs w:val="28"/>
-                </w:rPr>
-                <w:t xml:space="preserve">field </w:t>
-              </w:r>
-            </w:ins>
-            <w:ins w:id="12" w:author="Menon, Sunita (NIH/NCI) [C]" w:date="2022-08-30T15:16:00Z">
-              <w:r>
-                <w:rPr>
-                  <w:sz w:val="28"/>
-                  <w:szCs w:val="28"/>
-                </w:rPr>
-                <w:t>attached to the PI_Lab</w:t>
-              </w:r>
-            </w:ins>
-            <w:ins w:id="13" w:author="Menon, Sunita (NIH/NCI) [C]" w:date="2022-08-30T15:20:00Z">
-              <w:r>
-                <w:rPr>
-                  <w:sz w:val="28"/>
-                  <w:szCs w:val="28"/>
-                </w:rPr>
-                <w:t xml:space="preserve"> (or equivalent) </w:t>
-              </w:r>
-            </w:ins>
-            <w:ins w:id="14" w:author="Menon, Sunita (NIH/NCI) [C]" w:date="2022-08-30T15:17:00Z">
-              <w:r>
-                <w:rPr>
-                  <w:sz w:val="28"/>
-                  <w:szCs w:val="28"/>
-                </w:rPr>
-                <w:t xml:space="preserve">collection type with </w:t>
-              </w:r>
-            </w:ins>
-            <w:ins w:id="15" w:author="Menon, Sunita (NIH/NCI) [C]" w:date="2022-08-30T15:18:00Z">
-              <w:r>
-                <w:rPr>
-                  <w:sz w:val="28"/>
-                  <w:szCs w:val="28"/>
-                </w:rPr>
-                <w:t xml:space="preserve">the new field </w:t>
-              </w:r>
-            </w:ins>
-            <w:ins w:id="16" w:author="Menon, Sunita (NIH/NCI) [C]" w:date="2022-08-30T15:16:00Z">
-              <w:r>
-                <w:rPr>
-                  <w:i/>
-                  <w:iCs/>
-                  <w:sz w:val="28"/>
-                  <w:szCs w:val="28"/>
-                  <w:rPrChange w:id="17" w:author="Menon, Sunita (NIH/NCI) [C]" w:date="2022-08-30T15:17:00Z">
-                    <w:rPr/>
-                  </w:rPrChange>
-                </w:rPr>
-                <w:t>data_generator</w:t>
-              </w:r>
-              <w:r>
-                <w:rPr>
-                  <w:sz w:val="28"/>
-                  <w:szCs w:val="28"/>
-                  <w:rPrChange w:id="18" w:author="Menon, Sunita (NIH/NCI) [C]" w:date="2022-08-30T15:16:00Z">
-                    <w:rPr/>
-                  </w:rPrChange>
-                </w:rPr>
-                <w:t xml:space="preserve"> for all Archives</w:t>
-              </w:r>
-            </w:ins>
-            <w:ins w:id="19" w:author="Menon, Sunita (NIH/NCI) [C]" w:date="2022-08-30T15:19:00Z">
-              <w:r>
-                <w:rPr>
-                  <w:sz w:val="28"/>
-                  <w:szCs w:val="28"/>
-                </w:rPr>
-                <w:t xml:space="preserve"> (Base Paths)</w:t>
-              </w:r>
-            </w:ins>
-            <w:ins w:id="20" w:author="Menon, Sunita (NIH/NCI) [C]" w:date="2022-08-30T15:16:00Z">
-              <w:r>
-                <w:rPr>
-                  <w:sz w:val="28"/>
-                  <w:szCs w:val="28"/>
-                  <w:rPrChange w:id="21" w:author="Menon, Sunita (NIH/NCI) [C]" w:date="2022-08-30T15:16:00Z">
-                    <w:rPr/>
-                  </w:rPrChange>
-                </w:rPr>
-                <w:t xml:space="preserve">.  </w:t>
-              </w:r>
-            </w:ins>
-            <w:ins w:id="22" w:author="Menon, Sunita (NIH/NCI) [C]" w:date="2022-08-30T15:19:00Z">
-              <w:r>
-                <w:rPr>
-                  <w:sz w:val="28"/>
-                  <w:szCs w:val="28"/>
-                </w:rPr>
-                <w:t>A</w:t>
-              </w:r>
-            </w:ins>
-            <w:ins w:id="23" w:author="Menon, Sunita (NIH/NCI) [C]" w:date="2022-08-30T15:16:00Z">
-              <w:r>
-                <w:rPr>
-                  <w:sz w:val="28"/>
-                  <w:szCs w:val="28"/>
-                  <w:rPrChange w:id="24" w:author="Menon, Sunita (NIH/NCI) [C]" w:date="2022-08-30T15:16:00Z">
-                    <w:rPr/>
-                  </w:rPrChange>
-                </w:rPr>
-                <w:t xml:space="preserve">ll </w:t>
-              </w:r>
-            </w:ins>
-            <w:ins w:id="25" w:author="Menon, Sunita (NIH/NCI) [C]" w:date="2022-08-30T15:19:00Z">
-              <w:r>
-                <w:rPr>
-                  <w:sz w:val="28"/>
-                  <w:szCs w:val="28"/>
-                </w:rPr>
-                <w:t>screen</w:t>
-              </w:r>
-              <w:r>
-                <w:rPr>
-                  <w:sz w:val="28"/>
-                  <w:szCs w:val="28"/>
-                </w:rPr>
-                <w:t>s on the DME web application</w:t>
-              </w:r>
-              <w:r>
-                <w:rPr>
-                  <w:sz w:val="28"/>
-                  <w:szCs w:val="28"/>
-                </w:rPr>
-                <w:t xml:space="preserve"> that displayed </w:t>
-              </w:r>
-              <w:r>
-                <w:rPr>
-                  <w:sz w:val="28"/>
-                  <w:szCs w:val="28"/>
-                </w:rPr>
-                <w:t xml:space="preserve">the data_curator field </w:t>
-              </w:r>
-            </w:ins>
-            <w:ins w:id="26" w:author="Menon, Sunita (NIH/NCI) [C]" w:date="2022-08-30T15:16:00Z">
-              <w:r>
-                <w:rPr>
-                  <w:sz w:val="28"/>
-                  <w:szCs w:val="28"/>
-                  <w:rPrChange w:id="27" w:author="Menon, Sunita (NIH/NCI) [C]" w:date="2022-08-30T15:16:00Z">
-                    <w:rPr/>
-                  </w:rPrChange>
-                </w:rPr>
-                <w:t xml:space="preserve">will </w:t>
-              </w:r>
-            </w:ins>
-            <w:ins w:id="28" w:author="Menon, Sunita (NIH/NCI) [C]" w:date="2022-08-30T15:19:00Z">
-              <w:r>
-                <w:rPr>
-                  <w:sz w:val="28"/>
-                  <w:szCs w:val="28"/>
-                </w:rPr>
-                <w:t xml:space="preserve">now </w:t>
-              </w:r>
-            </w:ins>
-            <w:ins w:id="29" w:author="Menon, Sunita (NIH/NCI) [C]" w:date="2022-08-30T15:16:00Z">
-              <w:r>
-                <w:rPr>
-                  <w:sz w:val="28"/>
-                  <w:szCs w:val="28"/>
-                  <w:rPrChange w:id="30" w:author="Menon, Sunita (NIH/NCI) [C]" w:date="2022-08-30T15:16:00Z">
-                    <w:rPr/>
-                  </w:rPrChange>
-                </w:rPr>
-                <w:t>display the new attribute. This is a mandatory field</w:t>
-              </w:r>
-            </w:ins>
-            <w:ins w:id="31" w:author="Menon, Sunita (NIH/NCI) [C]" w:date="2022-08-30T15:18:00Z">
-              <w:r>
-                <w:rPr>
-                  <w:sz w:val="28"/>
-                  <w:szCs w:val="28"/>
-                </w:rPr>
-                <w:t xml:space="preserve"> for </w:t>
-              </w:r>
-            </w:ins>
-            <w:ins w:id="32" w:author="Menon, Sunita (NIH/NCI) [C]" w:date="2022-08-30T15:21:00Z">
-              <w:r>
-                <w:rPr>
-                  <w:sz w:val="28"/>
-                  <w:szCs w:val="28"/>
-                </w:rPr>
-                <w:t>archiving</w:t>
-              </w:r>
-            </w:ins>
-            <w:ins w:id="33" w:author="Menon, Sunita (NIH/NCI) [C]" w:date="2022-08-30T15:18:00Z">
-              <w:r>
-                <w:rPr>
-                  <w:sz w:val="28"/>
-                  <w:szCs w:val="28"/>
-                </w:rPr>
-                <w:t xml:space="preserve"> data</w:t>
-              </w:r>
-            </w:ins>
-            <w:ins w:id="34" w:author="Menon, Sunita (NIH/NCI) [C]" w:date="2022-08-30T15:21:00Z">
-              <w:r>
-                <w:rPr>
-                  <w:sz w:val="28"/>
-                  <w:szCs w:val="28"/>
-                </w:rPr>
-                <w:t xml:space="preserve"> to DME</w:t>
-              </w:r>
-            </w:ins>
-            <w:ins w:id="35" w:author="Menon, Sunita (NIH/NCI) [C]" w:date="2022-08-30T15:18:00Z">
-              <w:r>
-                <w:rPr>
-                  <w:sz w:val="28"/>
-                  <w:szCs w:val="28"/>
-                </w:rPr>
-                <w:t>.</w:t>
-              </w:r>
-            </w:ins>
-          </w:p>
-          <w:p>
-            <w:pPr>
-              <w:rPr>
-                <w:del w:id="36" w:author="Menon, Sunita (NIH/NCI) [C]" w:date="2022-08-30T15:18:00Z"/>
-                <w:sz w:val="28"/>
-                <w:szCs w:val="28"/>
-              </w:rPr>
-            </w:pPr>
+                <w:sz w:val="28"/>
+                <w:szCs w:val="28"/>
+              </w:rPr>
+            </w:pPr>
+          </w:p>
+          <w:p>
+            <w:pPr>
+              <w:rPr>
+                <w:sz w:val="28"/>
+                <w:szCs w:val="28"/>
+              </w:rPr>
+            </w:pPr>
+            <w:r>
+              <w:rPr>
+                <w:sz w:val="28"/>
+                <w:szCs w:val="28"/>
+                <w:u w:val="single"/>
+              </w:rPr>
+              <w:t>HPCDATAMGM-1629</w:t>
+            </w:r>
+            <w:r>
+              <w:rPr>
+                <w:sz w:val="28"/>
+                <w:szCs w:val="28"/>
+              </w:rPr>
+              <w:t xml:space="preserve">: </w:t>
+            </w:r>
+            <w:r>
+              <w:rPr>
+                <w:sz w:val="28"/>
+                <w:szCs w:val="28"/>
+              </w:rPr>
+              <w:t>Replaced the</w:t>
+            </w:r>
+            <w:r>
+              <w:rPr>
+                <w:sz w:val="28"/>
+                <w:szCs w:val="28"/>
+              </w:rPr>
+              <w:t xml:space="preserve"> </w:t>
+            </w:r>
+            <w:r>
+              <w:rPr>
+                <w:i/>
+                <w:iCs/>
+                <w:sz w:val="28"/>
+                <w:szCs w:val="28"/>
+              </w:rPr>
+              <w:t>data_curator</w:t>
+            </w:r>
+            <w:r>
+              <w:rPr>
+                <w:sz w:val="28"/>
+                <w:szCs w:val="28"/>
+              </w:rPr>
+              <w:t xml:space="preserve"> </w:t>
+            </w:r>
+            <w:r>
+              <w:rPr>
+                <w:sz w:val="28"/>
+                <w:szCs w:val="28"/>
+              </w:rPr>
+              <w:t>field attached to the PI_Lab</w:t>
+            </w:r>
+            <w:r>
+              <w:rPr>
+                <w:sz w:val="28"/>
+                <w:szCs w:val="28"/>
+              </w:rPr>
+              <w:t xml:space="preserve"> (or equivalent) </w:t>
+            </w:r>
+            <w:r>
+              <w:rPr>
+                <w:sz w:val="28"/>
+                <w:szCs w:val="28"/>
+              </w:rPr>
+              <w:t xml:space="preserve">collection type with the new field </w:t>
+            </w:r>
+            <w:r>
+              <w:rPr>
+                <w:i/>
+                <w:iCs/>
+                <w:sz w:val="28"/>
+                <w:szCs w:val="28"/>
+              </w:rPr>
+              <w:t>data_generator</w:t>
+            </w:r>
+            <w:r>
+              <w:rPr>
+                <w:sz w:val="28"/>
+                <w:szCs w:val="28"/>
+              </w:rPr>
+              <w:t xml:space="preserve"> for all Archives</w:t>
+            </w:r>
+            <w:r>
+              <w:rPr>
+                <w:sz w:val="28"/>
+                <w:szCs w:val="28"/>
+              </w:rPr>
+              <w:t xml:space="preserve"> (Base Paths)</w:t>
+            </w:r>
+            <w:r>
+              <w:rPr>
+                <w:sz w:val="28"/>
+                <w:szCs w:val="28"/>
+              </w:rPr>
+              <w:t xml:space="preserve">.  </w:t>
+            </w:r>
+            <w:r>
+              <w:rPr>
+                <w:sz w:val="28"/>
+                <w:szCs w:val="28"/>
+              </w:rPr>
+              <w:t>A</w:t>
+            </w:r>
+            <w:r>
+              <w:rPr>
+                <w:sz w:val="28"/>
+                <w:szCs w:val="28"/>
+              </w:rPr>
+              <w:t xml:space="preserve">ll </w:t>
+            </w:r>
+            <w:r>
+              <w:rPr>
+                <w:sz w:val="28"/>
+                <w:szCs w:val="28"/>
+              </w:rPr>
+              <w:t>screen</w:t>
+            </w:r>
+            <w:r>
+              <w:rPr>
+                <w:sz w:val="28"/>
+                <w:szCs w:val="28"/>
+              </w:rPr>
+              <w:t>s on the DME web application</w:t>
+            </w:r>
+            <w:r>
+              <w:rPr>
+                <w:sz w:val="28"/>
+                <w:szCs w:val="28"/>
+              </w:rPr>
+              <w:t xml:space="preserve"> that displayed </w:t>
+            </w:r>
+            <w:r>
+              <w:rPr>
+                <w:sz w:val="28"/>
+                <w:szCs w:val="28"/>
+              </w:rPr>
+              <w:t xml:space="preserve">the data_curator field </w:t>
+            </w:r>
+            <w:r>
+              <w:rPr>
+                <w:sz w:val="28"/>
+                <w:szCs w:val="28"/>
+              </w:rPr>
+              <w:t xml:space="preserve">will </w:t>
+            </w:r>
+            <w:r>
+              <w:rPr>
+                <w:sz w:val="28"/>
+                <w:szCs w:val="28"/>
+              </w:rPr>
+              <w:t xml:space="preserve">now </w:t>
+            </w:r>
+            <w:r>
+              <w:rPr>
+                <w:sz w:val="28"/>
+                <w:szCs w:val="28"/>
+              </w:rPr>
+              <w:t>display the new attribute. This is a mandatory field</w:t>
+            </w:r>
+            <w:r>
+              <w:rPr>
+                <w:sz w:val="28"/>
+                <w:szCs w:val="28"/>
+              </w:rPr>
+              <w:t xml:space="preserve"> for </w:t>
+            </w:r>
+            <w:r>
+              <w:rPr>
+                <w:sz w:val="28"/>
+                <w:szCs w:val="28"/>
+              </w:rPr>
+              <w:t>archiving</w:t>
+            </w:r>
+            <w:r>
+              <w:rPr>
+                <w:sz w:val="28"/>
+                <w:szCs w:val="28"/>
+              </w:rPr>
+              <w:t xml:space="preserve"> data</w:t>
+            </w:r>
+            <w:r>
+              <w:rPr>
+                <w:sz w:val="28"/>
+                <w:szCs w:val="28"/>
+              </w:rPr>
+              <w:t xml:space="preserve"> to DME</w:t>
+            </w:r>
+            <w:r>
+              <w:rPr>
+                <w:sz w:val="28"/>
+                <w:szCs w:val="28"/>
+              </w:rPr>
+              <w:t>.</w:t>
+            </w:r>
           </w:p>
           <w:p>
             <w:pPr>
@@ -10244,14 +10138,6 @@
     <w:abstractNumId w:val="33"/>
   </w:num>
 </w:numbering>
-</file>
-
-<file path=word/people.xml><?xml version="1.0" encoding="utf-8"?>
-<w15:people xmlns:wpc="http://schemas.microsoft.com/office/word/2010/wordprocessingCanvas" xmlns:cx="http://schemas.microsoft.com/office/drawing/2014/chartex" xmlns:cx1="http://schemas.microsoft.com/office/drawing/2015/9/8/chartex" xmlns:cx2="http://schemas.microsoft.com/office/drawing/2015/10/21/chartex" xmlns:cx3="http://schemas.microsoft.com/office/drawing/2016/5/9/chartex" xmlns:cx4="http://schemas.microsoft.com/office/drawing/2016/5/10/chartex" xmlns:cx5="http://schemas.microsoft.com/office/drawing/2016/5/11/chartex" xmlns:cx6="http://schemas.microsoft.com/office/drawing/2016/5/12/chartex" xmlns:cx7="http://schemas.microsoft.com/office/drawing/2016/5/13/chartex" xmlns:cx8="http://schemas.microsoft.com/office/drawing/2016/5/14/chartex" xmlns:mc="http://schemas.openxmlformats.org/markup-compatibility/2006" xmlns:aink="http://schemas.microsoft.com/office/drawing/2016/ink" xmlns:am3d="http://schemas.microsoft.com/office/drawing/2017/model3d" xmlns:o="urn:schemas-microsoft-com:office:office" xmlns:oel="http://schemas.microsoft.com/office/2019/extlst" xmlns:r="http://schemas.openxmlformats.org/officeDocument/2006/relationships" xmlns:m="http://schemas.openxmlformats.org/officeDocument/2006/math" xmlns:v="urn:schemas-microsoft-com:vml" xmlns:wp14="http://schemas.microsoft.com/office/word/2010/wordprocessingDrawing" xmlns:wp="http://schemas.openxmlformats.org/drawingml/2006/wordprocessingDrawing" xmlns:w10="urn:schemas-microsoft-com:office:word" xmlns:w="http://schemas.openxmlformats.org/wordprocessingml/2006/main" xmlns:w14="http://schemas.microsoft.com/office/word/2010/wordml" xmlns:w15="http://schemas.microsoft.com/office/word/2012/wordml" xmlns:w16cex="http://schemas.microsoft.com/office/word/2018/wordml/cex" xmlns:w16cid="http://schemas.microsoft.com/office/word/2016/wordml/cid" xmlns:w16="http://schemas.microsoft.com/office/word/2018/wordml" xmlns:w16sdtdh="http://schemas.microsoft.com/office/word/2020/wordml/sdtdatahash" xmlns:w16se="http://schemas.microsoft.com/office/word/2015/wordml/symex" xmlns:wpg="http://schemas.microsoft.com/office/word/2010/wordprocessingGroup" xmlns:wpi="http://schemas.microsoft.com/office/word/2010/wordprocessingInk" xmlns:wne="http://schemas.microsoft.com/office/word/2006/wordml" xmlns:wps="http://schemas.microsoft.com/office/word/2010/wordprocessingShape" mc:Ignorable="w14 w15 w16se w16cid w16 w16cex w16sdtdh wp14">
-  <w15:person w15:author="Menon, Sunita (NIH/NCI) [C]">
-    <w15:presenceInfo w15:providerId="AD" w15:userId="S::menons2@nih.gov::758ef455-cee4-484e-950b-e649d9c01c48"/>
-  </w15:person>
-</w15:people>
 </file>
 
 <file path=word/styles.xml><?xml version="1.0" encoding="utf-8"?>

</xml_diff>